<commit_message>
Update 1.5_GuiaEstudiante_Fase 1_Definicion Proyecto APT.docx
</commit_message>
<xml_diff>
--- a/Fase 1/Evidencias Grupales/1.5_GuiaEstudiante_Fase 1_Definicion Proyecto APT.docx
+++ b/Fase 1/Evidencias Grupales/1.5_GuiaEstudiante_Fase 1_Definicion Proyecto APT.docx
@@ -234,12 +234,12 @@
                 <wp:extent cx="6580505" cy="1486535"/>
                 <wp:effectExtent b="0" l="0" r="0" t="0"/>
                 <wp:wrapNone/>
-                <wp:docPr id="48" name="image1.png"/>
+                <wp:docPr id="48" name="image2.png"/>
                 <a:graphic>
                   <a:graphicData uri="http://schemas.openxmlformats.org/drawingml/2006/picture">
                     <pic:pic>
                       <pic:nvPicPr>
-                        <pic:cNvPr id="0" name="image1.png"/>
+                        <pic:cNvPr id="0" name="image2.png"/>
                         <pic:cNvPicPr preferRelativeResize="0"/>
                       </pic:nvPicPr>
                       <pic:blipFill>
@@ -1550,7 +1550,7 @@
                 <w:szCs w:val="20"/>
                 <w:rtl w:val="0"/>
               </w:rPr>
-              <w:t xml:space="preserve">Desarrollo Tecnologico,Gestion de datos y seguridad de la informacion</w:t>
+              <w:t xml:space="preserve">Desarrollo Tecnológico,Gestión de datos y seguridad de la información</w:t>
             </w:r>
             <w:r>
               <w:rPr>
@@ -1623,29 +1623,7 @@
                 <w:szCs w:val="20"/>
                 <w:rtl w:val="0"/>
               </w:rPr>
-              <w:t xml:space="preserve">Python, FastApi, Pydantic V2 ,Postgre SQL, SQLAlchemy 2.x async y migraciones</w:t>
-            </w:r>
-          </w:p>
-          <w:p>
-            <w:pPr>
-              <w:rPr>
-                <w:i w:val="1"/>
-                <w:iCs w:val="1"/>
-                <w:color w:val="548dd4"/>
-                <w:sz w:val="20"/>
-                <w:szCs w:val="20"/>
-              </w:rPr>
-            </w:pPr>
-            <w:r>
-              <w:rPr>
-                <w:i w:val="1"/>
-                <w:iCs w:val="1"/>
-                <w:color w:val="548dd4"/>
-                <w:sz w:val="20"/>
-                <w:szCs w:val="20"/>
-                <w:rtl w:val="0"/>
-              </w:rPr>
-              <w:t xml:space="preserve">Alembic </w:t>
+              <w:t xml:space="preserve">Diseñar, desarrollar e implementar soluciones de software y Diseñar, modelar y administrar arquitecturas de bases de datos</w:t>
             </w:r>
           </w:p>
         </w:tc>
@@ -1780,6 +1758,17 @@
             </w:pPr>
             <w:r>
               <w:rPr>
+                <w:i w:val="1"/>
+                <w:iCs w:val="1"/>
+                <w:color w:val="548dd4"/>
+                <w:sz w:val="20"/>
+                <w:szCs w:val="20"/>
+                <w:rtl w:val="0"/>
+              </w:rPr>
+              <w:t xml:space="preserve">3</w:t>
+            </w:r>
+            <w:r>
+              <w:rPr>
                 <w:b w:val="1"/>
                 <w:bCs w:val="1"/>
                 <w:color w:val="1f3864"/>
@@ -1787,7 +1776,7 @@
                 <w:szCs w:val="28"/>
                 <w:rtl w:val="0"/>
               </w:rPr>
-              <w:t xml:space="preserve">3. Fundamentación Proyecto APT</w:t>
+              <w:t xml:space="preserve">. Fundamentación Proyecto APT</w:t>
             </w:r>
           </w:p>
         </w:tc>
@@ -1944,10 +1933,6 @@
               <w:keepLines w:val="0"/>
               <w:pageBreakBefore w:val="0"/>
               <w:widowControl w:val="1"/>
-              <w:numPr>
-                <w:ilvl w:val="0"/>
-                <w:numId w:val="3"/>
-              </w:numPr>
               <w:pBdr>
                 <w:top w:space="0" w:sz="0" w:val="nil"/>
                 <w:left w:space="0" w:sz="0" w:val="nil"/>
@@ -1957,74 +1942,14 @@
               </w:pBdr>
               <w:shd w:fill="auto" w:val="clear"/>
               <w:spacing w:after="0" w:before="0" w:line="259" w:lineRule="auto"/>
-              <w:ind w:left="720" w:right="0" w:hanging="360"/>
-              <w:jc w:val="both"/>
-              <w:rPr>
-                <w:b w:val="0"/>
-                <w:bCs w:val="0"/>
-                <w:i w:val="1"/>
-                <w:iCs w:val="1"/>
-                <w:smallCaps w:val="0"/>
-                <w:strike w:val="0"/>
-                <w:color w:val="548dd4"/>
-                <w:sz w:val="20"/>
-                <w:szCs w:val="20"/>
-                <w:u w:val="none"/>
-                <w:shd w:fill="auto" w:val="clear"/>
-                <w:vertAlign w:val="baseline"/>
-              </w:rPr>
-            </w:pPr>
-            <w:r>
+              <w:ind w:left="0" w:right="0" w:firstLine="0"/>
+              <w:jc w:val="both"/>
               <w:rPr>
                 <w:i w:val="1"/>
                 <w:iCs w:val="1"/>
                 <w:color w:val="548dd4"/>
                 <w:sz w:val="20"/>
                 <w:szCs w:val="20"/>
-                <w:rtl w:val="0"/>
-              </w:rPr>
-              <w:t xml:space="preserve">Escogimos el tema debido a la importancia que tiene en el campo laboral ya que al abarcar tecnologias actuales nos permite desarrollar competencias utiles para los tiempos de ahora.</w:t>
-            </w:r>
-            <w:r>
-              <w:rPr>
-                <w:rtl w:val="0"/>
-              </w:rPr>
-            </w:r>
-          </w:p>
-          <w:p>
-            <w:pPr>
-              <w:keepNext w:val="0"/>
-              <w:keepLines w:val="0"/>
-              <w:pageBreakBefore w:val="0"/>
-              <w:widowControl w:val="1"/>
-              <w:numPr>
-                <w:ilvl w:val="0"/>
-                <w:numId w:val="3"/>
-              </w:numPr>
-              <w:pBdr>
-                <w:top w:space="0" w:sz="0" w:val="nil"/>
-                <w:left w:space="0" w:sz="0" w:val="nil"/>
-                <w:bottom w:space="0" w:sz="0" w:val="nil"/>
-                <w:right w:space="0" w:sz="0" w:val="nil"/>
-                <w:between w:space="0" w:sz="0" w:val="nil"/>
-              </w:pBdr>
-              <w:shd w:fill="auto" w:val="clear"/>
-              <w:spacing w:after="0" w:before="0" w:line="259" w:lineRule="auto"/>
-              <w:ind w:left="720" w:right="0" w:hanging="360"/>
-              <w:jc w:val="both"/>
-              <w:rPr>
-                <w:b w:val="1"/>
-                <w:bCs w:val="1"/>
-                <w:i w:val="1"/>
-                <w:iCs w:val="1"/>
-                <w:smallCaps w:val="0"/>
-                <w:strike w:val="0"/>
-                <w:color w:val="548dd4"/>
-                <w:sz w:val="20"/>
-                <w:szCs w:val="20"/>
-                <w:u w:val="none"/>
-                <w:shd w:fill="auto" w:val="clear"/>
-                <w:vertAlign w:val="baseline"/>
               </w:rPr>
             </w:pPr>
             <w:r>
@@ -2036,91 +1961,12 @@
                 <w:szCs w:val="20"/>
                 <w:rtl w:val="0"/>
               </w:rPr>
-              <w:t xml:space="preserve">El proyecto se ubica en Chile abarcando las labores de empresas mineras y energeticas las cuales en su mayoria se ubican en la parte norte del pais las cuales son cuna de la mayor concentracion de minerales y una mayor concentracion de radiacion solar debido a que es un desierto.</w:t>
-            </w:r>
-          </w:p>
-          <w:p>
-            <w:pPr>
-              <w:keepNext w:val="0"/>
-              <w:keepLines w:val="0"/>
-              <w:pageBreakBefore w:val="0"/>
-              <w:widowControl w:val="1"/>
-              <w:numPr>
-                <w:ilvl w:val="0"/>
-                <w:numId w:val="3"/>
-              </w:numPr>
-              <w:pBdr>
-                <w:top w:space="0" w:sz="0" w:val="nil"/>
-                <w:left w:space="0" w:sz="0" w:val="nil"/>
-                <w:bottom w:space="0" w:sz="0" w:val="nil"/>
-                <w:right w:space="0" w:sz="0" w:val="nil"/>
-                <w:between w:space="0" w:sz="0" w:val="nil"/>
-              </w:pBdr>
-              <w:shd w:fill="auto" w:val="clear"/>
-              <w:spacing w:after="0" w:before="0" w:line="259" w:lineRule="auto"/>
-              <w:ind w:left="720" w:right="0" w:hanging="360"/>
-              <w:jc w:val="both"/>
-              <w:rPr>
-                <w:i w:val="1"/>
-                <w:iCs w:val="1"/>
-                <w:color w:val="548dd4"/>
-                <w:sz w:val="20"/>
-                <w:szCs w:val="20"/>
-                <w:u w:val="none"/>
-              </w:rPr>
-            </w:pPr>
-            <w:r>
-              <w:rPr>
-                <w:i w:val="1"/>
-                <w:iCs w:val="1"/>
-                <w:color w:val="548dd4"/>
-                <w:sz w:val="20"/>
-                <w:szCs w:val="20"/>
-                <w:rtl w:val="0"/>
-              </w:rPr>
-              <w:t xml:space="preserve">Esta situación impacta a los trabajadores de empresas contratistas, mineras y empresas energeticas puesto que la situación la cual se aborda es la de la gestion de documentos de los trabajadores y de maquinaria.</w:t>
-            </w:r>
-          </w:p>
-          <w:p>
-            <w:pPr>
-              <w:keepNext w:val="0"/>
-              <w:keepLines w:val="0"/>
-              <w:pageBreakBefore w:val="0"/>
-              <w:widowControl w:val="1"/>
-              <w:numPr>
-                <w:ilvl w:val="0"/>
-                <w:numId w:val="3"/>
-              </w:numPr>
-              <w:pBdr>
-                <w:top w:space="0" w:sz="0" w:val="nil"/>
-                <w:left w:space="0" w:sz="0" w:val="nil"/>
-                <w:bottom w:space="0" w:sz="0" w:val="nil"/>
-                <w:right w:space="0" w:sz="0" w:val="nil"/>
-                <w:between w:space="0" w:sz="0" w:val="nil"/>
-              </w:pBdr>
-              <w:shd w:fill="auto" w:val="clear"/>
-              <w:spacing w:after="0" w:before="0" w:line="259" w:lineRule="auto"/>
-              <w:ind w:left="720" w:right="0" w:hanging="360"/>
-              <w:jc w:val="both"/>
-              <w:rPr>
-                <w:i w:val="1"/>
-                <w:iCs w:val="1"/>
-                <w:color w:val="548dd4"/>
-                <w:sz w:val="20"/>
-                <w:szCs w:val="20"/>
-                <w:u w:val="none"/>
-              </w:rPr>
-            </w:pPr>
-            <w:r>
-              <w:rPr>
-                <w:i w:val="1"/>
-                <w:iCs w:val="1"/>
-                <w:color w:val="548dd4"/>
-                <w:sz w:val="20"/>
-                <w:szCs w:val="20"/>
-                <w:rtl w:val="0"/>
-              </w:rPr>
-              <w:t xml:space="preserve">El aporte de valor para este proyecto es el de poder facilitar la gestion de estos contratos mediante una plataforma la cual automatize todo este proceso ahorrando tanto recursos como tiempo.</w:t>
+              <w:t xml:space="preserve">La gestión documental y acreditación en la industria minera y energética exige alta precisión transaccional y cumplimiento normativo estricto. Acredittia mitiga el riesgo operativo mediante una plataforma que automatiza estas validaciones. El valor técnico radica en reemplazar procesos manuales propensos a fallos críticos con una arquitectura multi-tenant escalable, garantizando el aislamiento de datos y el procesamiento asíncrono de alto volumen. </w:t>
+            </w:r>
+            <w:r>
+              <w:rPr>
+                <w:rtl w:val="0"/>
+              </w:rPr>
             </w:r>
           </w:p>
           <w:p>
@@ -2215,7 +2061,7 @@
                 <w:szCs w:val="20"/>
                 <w:rtl w:val="0"/>
               </w:rPr>
-              <w:t xml:space="preserve">Se espera lograr con este proyecto la facilitación de ciertos procesos y la mejora del tiempo de estos mismos mediante una plataforma que permita la gestion de la documentacion y del pago de estos servicios agilizando los procesos.</w:t>
+              <w:t xml:space="preserve">Desarrollo, optimización e implementación del núcleo transaccional para Acredittia. Involucra el diseño de una base de datos relacional con políticas de seguridad, la construcción de una API RESTful robusta </w:t>
             </w:r>
             <w:r>
               <w:rPr>
@@ -2305,7 +2151,7 @@
                 <w:szCs w:val="20"/>
                 <w:rtl w:val="0"/>
               </w:rPr>
-              <w:t xml:space="preserve">Se relaciona en cierta medida el proyecto de APT puesto que abarca algunas tecnologias ya enseñadas en Duoc UC mientras que también trae nuevas las cuales desconocemos pero son utiles para el campo laboral actual</w:t>
+              <w:t xml:space="preserve">Se relaciona en cierta medida el proyecto de APT puesto que abarca algunas tecnologías ya enseñadas en Duoc UC mientras que también trae nuevas las cuales desconocemos pero son útiles para el campo laboral actual</w:t>
             </w:r>
           </w:p>
           <w:p>
@@ -2353,7 +2199,7 @@
                 <w:szCs w:val="20"/>
                 <w:rtl w:val="0"/>
               </w:rPr>
-              <w:t xml:space="preserve">Las competencias son necesarias puesto que nos enseñaron la base de como resolver la problematica que vamos a abordar en el proyecto y nos desafían a aprender por nuestra cuenta nuevac competencias para crecer en este campo.</w:t>
+              <w:t xml:space="preserve">Las competencias son necesarias puesto que nos enseñaron la base de como resolver la problemática que vamos a abordar en el proyecto y nos desafían a aprender por nuestra cuenta nuevas competencias para crecer en este campo.</w:t>
             </w:r>
             <w:r>
               <w:rPr>
@@ -2439,7 +2285,7 @@
                 <w:szCs w:val="20"/>
                 <w:rtl w:val="0"/>
               </w:rPr>
-              <w:t xml:space="preserve">Mis intereses profesionales son el de poder desarrollarme en el area de análisis de datos la cual con este proyecto se ve reflejada en el manejo de bases de datos y el uso de apis,este desafío me permitira desarrollarme en mayor manera al saber como funciona un proyecto real en el mundo laboral.</w:t>
+              <w:t xml:space="preserve">Mis intereses profesionales son el de poder desarrollarme en el área de análisis de datos la cual con este proyecto se ve reflejada en el manejo de bases de datos y el uso de apis,este desafío me permitirá desarrollarme en mayor manera al saber como funciona un proyecto real en el mundo laboral.</w:t>
             </w:r>
           </w:p>
         </w:tc>
@@ -2528,7 +2374,7 @@
                 <w:szCs w:val="20"/>
                 <w:rtl w:val="0"/>
               </w:rPr>
-              <w:t xml:space="preserve">Este proyecto es posible de desarrollar puesto que no requiere una cantidad exagerada de recursos y tiempo,pero existen ciertos factores tanto internos como externos los cuales podrian dificultar la realizacion del mismo tanto como el desconocimiento de ciertas tecnologias o el retraso de desarrollo debido a problemas fuera de nuestro control por retrasos en el tiempo del semestre, complementando lo anterior todos estos posibles factores tienen solucion como la de organizar todo el tiempo de antemano y estableciendo tiempos de contencion en caso de que se genere alguna de estas dificultades.</w:t>
+              <w:t xml:space="preserve">Este proyecto es posible de desarrollar puesto que no requiere una cantidad exagerada de recursos y tiempo,pero existen ciertos factores tanto internos como externos los cuales podrían dificultar la realización del mismo tanto como el desconocimiento de ciertas tecnologías o el retraso de desarrollo debido a problemas fuera de nuestro control por retrasos en el tiempo del semestre, complementando lo anterior todos estos posibles factores tienen solución como la de organizar todo el tiempo de antemano y estableciendo tiempos de contención en caso de que se genere alguna de estas dificultades.</w:t>
             </w:r>
             <w:r>
               <w:rPr>
@@ -2836,7 +2682,7 @@
                 <w:szCs w:val="20"/>
                 <w:rtl w:val="0"/>
               </w:rPr>
-              <w:t xml:space="preserve">Los objetivos generales del proyecto en el cual nos encargamos de la parte del backend es el de poder conectar cada una de las apis entre el backend y la base de datos la cual en este caso es postgreSQL si logramos ese objetivo tendremos una metrica fiable del cumplimiento general del proyecto</w:t>
+              <w:t xml:space="preserve">Diseñar, implementar y desplegar una arquitectura backend escalable, segura y asíncrona que automatice la gestión y validación documental para operaciones críticas del sector minero e industrial.</w:t>
             </w:r>
           </w:p>
         </w:tc>
@@ -2894,7 +2740,7 @@
             <w:pPr>
               <w:numPr>
                 <w:ilvl w:val="0"/>
-                <w:numId w:val="4"/>
+                <w:numId w:val="3"/>
               </w:numPr>
               <w:spacing w:after="0" w:afterAutospacing="0"/>
               <w:ind w:left="720" w:hanging="360"/>
@@ -2917,16 +2763,44 @@
                 <w:szCs w:val="20"/>
                 <w:rtl w:val="0"/>
               </w:rPr>
-              <w:t xml:space="preserve">Lograr aislar las credenciales de acceso</w:t>
+              <w:t xml:space="preserve">Modelar e implementar el esquema relacional en PostgreSQL incorporando Row-Level Security para garantizar el aislamiento estricto entre múltiples clientes.</w:t>
             </w:r>
           </w:p>
           <w:p>
             <w:pPr>
               <w:numPr>
                 <w:ilvl w:val="0"/>
-                <w:numId w:val="4"/>
+                <w:numId w:val="3"/>
               </w:numPr>
               <w:spacing w:after="0" w:afterAutospacing="0"/>
+              <w:ind w:left="720" w:hanging="360"/>
+              <w:jc w:val="both"/>
+              <w:rPr>
+                <w:i w:val="1"/>
+                <w:iCs w:val="1"/>
+                <w:color w:val="548dd4"/>
+                <w:sz w:val="20"/>
+                <w:szCs w:val="20"/>
+              </w:rPr>
+            </w:pPr>
+            <w:r>
+              <w:rPr>
+                <w:i w:val="1"/>
+                <w:iCs w:val="1"/>
+                <w:color w:val="548dd4"/>
+                <w:sz w:val="20"/>
+                <w:szCs w:val="20"/>
+                <w:rtl w:val="0"/>
+              </w:rPr>
+              <w:t xml:space="preserve">Construir y documentar una API RESTful eficiente utilizando FastAPI, estableciendo contratos de comunicación claros y seguros para el consumo de clientes externos e internos.</w:t>
+            </w:r>
+          </w:p>
+          <w:p>
+            <w:pPr>
+              <w:numPr>
+                <w:ilvl w:val="0"/>
+                <w:numId w:val="3"/>
+              </w:numPr>
               <w:ind w:left="720" w:hanging="360"/>
               <w:jc w:val="both"/>
               <w:rPr>
@@ -2947,66 +2821,7 @@
                 <w:szCs w:val="20"/>
                 <w:rtl w:val="0"/>
               </w:rPr>
-              <w:t xml:space="preserve">Prevenir Inyecciones SQL</w:t>
-            </w:r>
-          </w:p>
-          <w:p>
-            <w:pPr>
-              <w:numPr>
-                <w:ilvl w:val="0"/>
-                <w:numId w:val="4"/>
-              </w:numPr>
-              <w:spacing w:after="0" w:afterAutospacing="0"/>
-              <w:ind w:left="720" w:hanging="360"/>
-              <w:jc w:val="both"/>
-              <w:rPr>
-                <w:i w:val="1"/>
-                <w:iCs w:val="1"/>
-                <w:color w:val="548dd4"/>
-                <w:sz w:val="20"/>
-                <w:szCs w:val="20"/>
-                <w:u w:val="none"/>
-              </w:rPr>
-            </w:pPr>
-            <w:r>
-              <w:rPr>
-                <w:i w:val="1"/>
-                <w:iCs w:val="1"/>
-                <w:color w:val="548dd4"/>
-                <w:sz w:val="20"/>
-                <w:szCs w:val="20"/>
-                <w:rtl w:val="0"/>
-              </w:rPr>
-              <w:t xml:space="preserve">Configurar Reconnection Policies</w:t>
-            </w:r>
-          </w:p>
-          <w:p>
-            <w:pPr>
-              <w:numPr>
-                <w:ilvl w:val="0"/>
-                <w:numId w:val="4"/>
-              </w:numPr>
-              <w:ind w:left="720" w:hanging="360"/>
-              <w:jc w:val="both"/>
-              <w:rPr>
-                <w:i w:val="1"/>
-                <w:iCs w:val="1"/>
-                <w:color w:val="548dd4"/>
-                <w:sz w:val="20"/>
-                <w:szCs w:val="20"/>
-                <w:u w:val="none"/>
-              </w:rPr>
-            </w:pPr>
-            <w:r>
-              <w:rPr>
-                <w:i w:val="1"/>
-                <w:iCs w:val="1"/>
-                <w:color w:val="548dd4"/>
-                <w:sz w:val="20"/>
-                <w:szCs w:val="20"/>
-                <w:rtl w:val="0"/>
-              </w:rPr>
-              <w:t xml:space="preserve">Optimizar las consultas de Apis</w:t>
+              <w:t xml:space="preserve">Desplegar el ecosistema del backend en una arquitectura de contenedores, configurando la infraestructura necesaria para asegurar la operación continua de la plataforma.</w:t>
             </w:r>
           </w:p>
         </w:tc>
@@ -3272,7 +3087,7 @@
                 <w:szCs w:val="20"/>
                 <w:rtl w:val="0"/>
               </w:rPr>
-              <w:t xml:space="preserve">La metodologia que se abarcara sera la de Scrum la cual se basa en Sprint cortos los cuales nos ayudaran a organizar de mejor manera cada uno de las actividades que se deberán realizar permitiendonos tener de manera más organizada el proyecto la cual estaria organizada de la siguiente manera:</w:t>
+              <w:t xml:space="preserve">La metodología que se abarcara sera la de Scrum la cual se basa en Sprint cortos los cuales nos ayudaran a organizar de mejor manera cada uno de las actividades que se deberán realizar permitiéndonos tener de manera más organizada el proyecto la cual estaría organizada de la siguiente manera:</w:t>
             </w:r>
           </w:p>
           <w:p>
@@ -3302,7 +3117,7 @@
                 <w:szCs w:val="20"/>
                 <w:rtl w:val="0"/>
               </w:rPr>
-              <w:t xml:space="preserve">Creacion de Sprints semanales en las cuales se definen pequeñas funcionalidades requeridas del sistema</w:t>
+              <w:t xml:space="preserve">Creación de Sprints semanales en las cuales se definen pequeñas funcionalidades requeridas del sistema</w:t>
             </w:r>
           </w:p>
           <w:p>
@@ -3332,7 +3147,7 @@
                 <w:szCs w:val="20"/>
                 <w:rtl w:val="0"/>
               </w:rPr>
-              <w:t xml:space="preserve">Creacion de un Historial de comportamiento del servidor las cuales den una idea del funcionamiento general de cada funcionalidad</w:t>
+              <w:t xml:space="preserve">Creación de un Historial de comportamiento del servidor las cuales den una idea del funcionamiento general de cada funcionalidad</w:t>
             </w:r>
           </w:p>
           <w:p>
@@ -3367,23 +3182,6 @@
         </w:tc>
       </w:tr>
     </w:tbl>
-    <w:p>
-      <w:pPr>
-        <w:spacing w:after="0" w:line="360" w:lineRule="auto"/>
-        <w:jc w:val="both"/>
-        <w:rPr>
-          <w:b w:val="1"/>
-          <w:bCs w:val="1"/>
-          <w:sz w:val="24"/>
-          <w:szCs w:val="24"/>
-        </w:rPr>
-      </w:pPr>
-      <w:r>
-        <w:rPr>
-          <w:rtl w:val="0"/>
-        </w:rPr>
-      </w:r>
-    </w:p>
     <w:p>
       <w:pPr>
         <w:spacing w:after="0" w:line="240" w:lineRule="auto"/>
@@ -3394,9 +3192,6 @@
           <w:szCs w:val="24"/>
         </w:rPr>
       </w:pPr>
-      <w:r>
-        <w:br w:type="page"/>
-      </w:r>
       <w:r>
         <w:rPr>
           <w:rtl w:val="0"/>
@@ -3996,7 +3791,7 @@
                 <w:szCs w:val="18"/>
                 <w:rtl w:val="0"/>
               </w:rPr>
-              <w:t xml:space="preserve">Este Documento define de manera estructurada y tecnica todo lo que el sistema debe hacer,requisitos funcionales y no funcionales y las restricciones tecnicas del mismo entre otros,Las historias de usuario tienen como objetivo capturar requisitos de manera simple enfocandose en la perspectiva del usuario final</w:t>
+              <w:t xml:space="preserve">Este Documento define de manera estructurada y técnica todo lo que el sistema debe hacer,requisitos funcionales y no funcionales y las restricciones técnicas del mismo entre otros,Las historias de usuario tienen como objetivo capturar requisitos de manera simple enfocándose en la perspectiva del usuario final</w:t>
             </w:r>
             <w:r>
               <w:rPr>
@@ -4176,7 +3971,7 @@
                 <w:szCs w:val="18"/>
                 <w:rtl w:val="0"/>
               </w:rPr>
-              <w:t xml:space="preserve">Es un esquema visual basico y muestra quien interactua con un sistema y que puede hacer en el</w:t>
+              <w:t xml:space="preserve">Es un esquema visual basic y muestra quien interactúa con un sistema y que puede hacer en el</w:t>
             </w:r>
             <w:r>
               <w:rPr>
@@ -4377,7 +4172,7 @@
                 <w:szCs w:val="18"/>
                 <w:rtl w:val="0"/>
               </w:rPr>
-              <w:t xml:space="preserve">Mapa visual que muestra la estructura interna del código de un sistema definiendo las clases del mismo con atributos y metodos</w:t>
+              <w:t xml:space="preserve">Mapa visual que muestra la estructura interna del código de un sistema definiendo las clases del mismo con atributos y métodos</w:t>
             </w:r>
           </w:p>
         </w:tc>
@@ -4706,7 +4501,7 @@
                 <w:szCs w:val="18"/>
                 <w:rtl w:val="0"/>
               </w:rPr>
-              <w:t xml:space="preserve">Es un esquema visual que organiza cómo se va a guardar la informacion en un sistema.</w:t>
+              <w:t xml:space="preserve">Es un esquema visual que organiza cómo se va a guardar la información en un sistema.</w:t>
             </w:r>
           </w:p>
         </w:tc>
@@ -4863,7 +4658,7 @@
                 <w:szCs w:val="18"/>
                 <w:rtl w:val="0"/>
               </w:rPr>
-              <w:t xml:space="preserve">Es una representacion inicial de como deberia ser el modelo final</w:t>
+              <w:t xml:space="preserve">Es una representación inicial de como debería ser el modelo final</w:t>
             </w:r>
           </w:p>
         </w:tc>
@@ -5257,7 +5052,7 @@
                 <w:color w:val="1f3864"/>
                 <w:rtl w:val="0"/>
               </w:rPr>
-              <w:t xml:space="preserve">Resolucion de conflictos</w:t>
+              <w:t xml:space="preserve">Resolución de conflictos</w:t>
             </w:r>
           </w:p>
         </w:tc>
@@ -5414,7 +5209,7 @@
                 <w:color w:val="1f3864"/>
                 <w:rtl w:val="0"/>
               </w:rPr>
-              <w:t xml:space="preserve">Documentacion de stakeholders</w:t>
+              <w:t xml:space="preserve">Documentación de stakeholders</w:t>
             </w:r>
           </w:p>
         </w:tc>
@@ -5700,125 +5495,6 @@
         </w:tc>
       </w:tr>
     </w:tbl>
-    <w:p>
-      <w:pPr>
-        <w:spacing w:after="0" w:line="360" w:lineRule="auto"/>
-        <w:jc w:val="both"/>
-        <w:rPr>
-          <w:b w:val="1"/>
-          <w:bCs w:val="1"/>
-          <w:sz w:val="24"/>
-          <w:szCs w:val="24"/>
-        </w:rPr>
-      </w:pPr>
-      <w:r>
-        <w:rPr>
-          <w:rtl w:val="0"/>
-        </w:rPr>
-      </w:r>
-    </w:p>
-    <w:p>
-      <w:pPr>
-        <w:spacing w:after="0" w:line="360" w:lineRule="auto"/>
-        <w:jc w:val="both"/>
-        <w:rPr>
-          <w:b w:val="1"/>
-          <w:bCs w:val="1"/>
-          <w:sz w:val="24"/>
-          <w:szCs w:val="24"/>
-        </w:rPr>
-      </w:pPr>
-      <w:r>
-        <w:rPr>
-          <w:rtl w:val="0"/>
-        </w:rPr>
-      </w:r>
-    </w:p>
-    <w:p>
-      <w:pPr>
-        <w:spacing w:after="0" w:line="360" w:lineRule="auto"/>
-        <w:jc w:val="both"/>
-        <w:rPr>
-          <w:b w:val="1"/>
-          <w:bCs w:val="1"/>
-          <w:sz w:val="24"/>
-          <w:szCs w:val="24"/>
-        </w:rPr>
-      </w:pPr>
-      <w:r>
-        <w:rPr>
-          <w:rtl w:val="0"/>
-        </w:rPr>
-      </w:r>
-    </w:p>
-    <w:p>
-      <w:pPr>
-        <w:spacing w:after="0" w:line="360" w:lineRule="auto"/>
-        <w:jc w:val="both"/>
-        <w:rPr>
-          <w:b w:val="1"/>
-          <w:bCs w:val="1"/>
-          <w:sz w:val="24"/>
-          <w:szCs w:val="24"/>
-        </w:rPr>
-      </w:pPr>
-      <w:r>
-        <w:rPr>
-          <w:rtl w:val="0"/>
-        </w:rPr>
-      </w:r>
-    </w:p>
-    <w:p>
-      <w:pPr>
-        <w:spacing w:after="0" w:line="360" w:lineRule="auto"/>
-        <w:jc w:val="both"/>
-        <w:rPr>
-          <w:b w:val="1"/>
-          <w:bCs w:val="1"/>
-          <w:sz w:val="24"/>
-          <w:szCs w:val="24"/>
-        </w:rPr>
-      </w:pPr>
-      <w:r>
-        <w:rPr>
-          <w:rtl w:val="0"/>
-        </w:rPr>
-      </w:r>
-    </w:p>
-    <w:p>
-      <w:pPr>
-        <w:spacing w:after="0" w:line="360" w:lineRule="auto"/>
-        <w:jc w:val="both"/>
-        <w:rPr>
-          <w:b w:val="1"/>
-          <w:bCs w:val="1"/>
-          <w:sz w:val="24"/>
-          <w:szCs w:val="24"/>
-        </w:rPr>
-      </w:pPr>
-      <w:r>
-        <w:rPr>
-          <w:rtl w:val="0"/>
-        </w:rPr>
-      </w:r>
-    </w:p>
-    <w:p>
-      <w:pPr>
-        <w:spacing w:after="0" w:line="360" w:lineRule="auto"/>
-        <w:jc w:val="both"/>
-        <w:rPr>
-          <w:b w:val="1"/>
-          <w:bCs w:val="1"/>
-          <w:sz w:val="24"/>
-          <w:szCs w:val="24"/>
-        </w:rPr>
-      </w:pPr>
-      <w:r>
-        <w:rPr>
-          <w:rtl w:val="0"/>
-        </w:rPr>
-      </w:r>
-    </w:p>
     <w:p>
       <w:pPr>
         <w:spacing w:after="0" w:line="360" w:lineRule="auto"/>
@@ -9141,12 +8817,12 @@
               <wp:inline distB="0" distT="0" distL="0" distR="0">
                 <wp:extent cx="1996440" cy="428625"/>
                 <wp:effectExtent b="0" l="0" r="0" t="0"/>
-                <wp:docPr descr="http://www.duoc.cl/normasgraficas/normasgraficas/marca-duoc/6logo-fondo-transparente/fondo-transparente.png" id="49" name="image2.png"/>
+                <wp:docPr descr="http://www.duoc.cl/normasgraficas/normasgraficas/marca-duoc/6logo-fondo-transparente/fondo-transparente.png" id="49" name="image1.png"/>
                 <a:graphic>
                   <a:graphicData uri="http://schemas.openxmlformats.org/drawingml/2006/picture">
                     <pic:pic>
                       <pic:nvPicPr>
-                        <pic:cNvPr descr="http://www.duoc.cl/normasgraficas/normasgraficas/marca-duoc/6logo-fondo-transparente/fondo-transparente.png" id="0" name="image2.png"/>
+                        <pic:cNvPr descr="http://www.duoc.cl/normasgraficas/normasgraficas/marca-duoc/6logo-fondo-transparente/fondo-transparente.png" id="0" name="image1.png"/>
                         <pic:cNvPicPr preferRelativeResize="0"/>
                       </pic:nvPicPr>
                       <pic:blipFill>
@@ -9438,100 +9114,6 @@
       <w:lvlText w:val="●"/>
       <w:lvlJc w:val="left"/>
       <w:pPr>
-        <w:ind w:left="1080" w:hanging="360"/>
-      </w:pPr>
-      <w:rPr>
-        <w:rFonts w:ascii="Noto Sans Symbols" w:cs="Noto Sans Symbols" w:eastAsia="Noto Sans Symbols" w:hAnsi="Noto Sans Symbols"/>
-      </w:rPr>
-    </w:lvl>
-    <w:lvl w:ilvl="1">
-      <w:start w:val="1"/>
-      <w:numFmt w:val="lowerLetter"/>
-      <w:lvlText w:val="%2."/>
-      <w:lvlJc w:val="left"/>
-      <w:pPr>
-        <w:ind w:left="1800" w:hanging="360"/>
-      </w:pPr>
-      <w:rPr/>
-    </w:lvl>
-    <w:lvl w:ilvl="2">
-      <w:start w:val="1"/>
-      <w:numFmt w:val="lowerRoman"/>
-      <w:lvlText w:val="%3."/>
-      <w:lvlJc w:val="right"/>
-      <w:pPr>
-        <w:ind w:left="2520" w:hanging="180"/>
-      </w:pPr>
-      <w:rPr/>
-    </w:lvl>
-    <w:lvl w:ilvl="3">
-      <w:start w:val="1"/>
-      <w:numFmt w:val="decimal"/>
-      <w:lvlText w:val="%4."/>
-      <w:lvlJc w:val="left"/>
-      <w:pPr>
-        <w:ind w:left="3240" w:hanging="360"/>
-      </w:pPr>
-      <w:rPr/>
-    </w:lvl>
-    <w:lvl w:ilvl="4">
-      <w:start w:val="1"/>
-      <w:numFmt w:val="lowerLetter"/>
-      <w:lvlText w:val="%5."/>
-      <w:lvlJc w:val="left"/>
-      <w:pPr>
-        <w:ind w:left="3960" w:hanging="360"/>
-      </w:pPr>
-      <w:rPr/>
-    </w:lvl>
-    <w:lvl w:ilvl="5">
-      <w:start w:val="1"/>
-      <w:numFmt w:val="lowerRoman"/>
-      <w:lvlText w:val="%6."/>
-      <w:lvlJc w:val="right"/>
-      <w:pPr>
-        <w:ind w:left="4680" w:hanging="180"/>
-      </w:pPr>
-      <w:rPr/>
-    </w:lvl>
-    <w:lvl w:ilvl="6">
-      <w:start w:val="1"/>
-      <w:numFmt w:val="decimal"/>
-      <w:lvlText w:val="%7."/>
-      <w:lvlJc w:val="left"/>
-      <w:pPr>
-        <w:ind w:left="5400" w:hanging="360"/>
-      </w:pPr>
-      <w:rPr/>
-    </w:lvl>
-    <w:lvl w:ilvl="7">
-      <w:start w:val="1"/>
-      <w:numFmt w:val="lowerLetter"/>
-      <w:lvlText w:val="%8."/>
-      <w:lvlJc w:val="left"/>
-      <w:pPr>
-        <w:ind w:left="6120" w:hanging="360"/>
-      </w:pPr>
-      <w:rPr/>
-    </w:lvl>
-    <w:lvl w:ilvl="8">
-      <w:start w:val="1"/>
-      <w:numFmt w:val="lowerRoman"/>
-      <w:lvlText w:val="%9."/>
-      <w:lvlJc w:val="right"/>
-      <w:pPr>
-        <w:ind w:left="6840" w:hanging="180"/>
-      </w:pPr>
-      <w:rPr/>
-    </w:lvl>
-  </w:abstractNum>
-  <w:abstractNum w:abstractNumId="4">
-    <w:lvl w:ilvl="0">
-      <w:start w:val="1"/>
-      <w:numFmt w:val="bullet"/>
-      <w:lvlText w:val="●"/>
-      <w:lvlJc w:val="left"/>
-      <w:pPr>
         <w:ind w:left="720" w:hanging="360"/>
       </w:pPr>
       <w:rPr>
@@ -9643,9 +9225,6 @@
   </w:num>
   <w:num w:numId="3">
     <w:abstractNumId w:val="3"/>
-  </w:num>
-  <w:num w:numId="4">
-    <w:abstractNumId w:val="4"/>
   </w:num>
 </w:numbering>
 </file>

</xml_diff>